<commit_message>
Fix install guide: don't assume SSH/private access — cover SSH/HTTPS/ZIP + bash fallback
Co-Authored-By: Claude Opus 4.7 (1M context) <noreply@anthropic.com>
</commit_message>
<xml_diff>
--- a/docs/how-to-qualify.docx
+++ b/docs/how-to-qualify.docx
@@ -118,33 +118,19 @@
       </w:r>
     </w:p>
     <w:p>
-      <w:pPr>
-        <w:shd w:val="clear" w:fill="EFEAE3"/>
-      </w:pPr>
       <w:r>
         <w:rPr>
-          <w:rFonts w:ascii="Consolas" w:hAnsi="Consolas"/>
-          <w:sz w:val="16"/>
+          <w:b/>
         </w:rPr>
-        <w:t>git clone git@github.com:DeepJam/paraqualis-skills.git</w:t>
-        <w:br/>
-        <w:t>cd paraqualis-skills</w:t>
-        <w:br/>
-        <w:t>./install.sh            # symlinks the commands, skills, and sub-agents into ~/.claude/</w:t>
+        <w:t>Step 1 — get the files.</w:t>
+      </w:r>
+      <w:r>
+        <w:t xml:space="preserve"> Use whichever route your access allows. *(The repository is</w:t>
       </w:r>
     </w:p>
     <w:p>
       <w:r>
-        <w:t xml:space="preserve">Then </w:t>
-      </w:r>
-      <w:r>
-        <w:rPr>
-          <w:b/>
-        </w:rPr>
-        <w:t>restart Claude Code</w:t>
-      </w:r>
-      <w:r>
-        <w:t xml:space="preserve"> so it registers the new command, skills, and sub-agents.</w:t>
+        <w:t>private — you must first be granted access by ParaQualis, or use a copy they provide.)*</w:t>
       </w:r>
     </w:p>
     <w:p>
@@ -155,10 +141,15 @@
         <w:rPr>
           <w:b/>
         </w:rPr>
-        <w:t>Check it's live:</w:t>
+        <w:t>SSH</w:t>
       </w:r>
       <w:r>
-        <w:t xml:space="preserve"> type `/` and confirm `/qualify` appears.</w:t>
+        <w:t xml:space="preserve"> (collaborators with an SSH key on the repo):</w:t>
+      </w:r>
+    </w:p>
+    <w:p>
+      <w:r>
+        <w:t xml:space="preserve">  `git clone git@github.com:DeepJam/paraqualis-skills.git`</w:t>
       </w:r>
     </w:p>
     <w:p>
@@ -169,15 +160,102 @@
         <w:rPr>
           <w:b/>
         </w:rPr>
-        <w:t>Word/Excel output</w:t>
+        <w:t>HTTPS</w:t>
       </w:r>
       <w:r>
-        <w:t xml:space="preserve"> needs the Python libraries `python-docx` and `openpyxl`</w:t>
+        <w:t xml:space="preserve"> (collaborators — prompts for a GitHub token/login):</w:t>
       </w:r>
     </w:p>
     <w:p>
       <w:r>
-        <w:t xml:space="preserve">  (`pip install python-docx openpyxl`). Markdown and the scripts work without them.</w:t>
+        <w:t xml:space="preserve">  `git clone https://github.com/DeepJam/paraqualis-skills.git`</w:t>
+      </w:r>
+    </w:p>
+    <w:p>
+      <w:pPr>
+        <w:pStyle w:val="ListBullet"/>
+      </w:pPr>
+      <w:r>
+        <w:rPr>
+          <w:b/>
+        </w:rPr>
+        <w:t>No git, or no access configured:</w:t>
+      </w:r>
+      <w:r>
+        <w:t xml:space="preserve"> on the GitHub page choose </w:t>
+      </w:r>
+      <w:r>
+        <w:rPr>
+          <w:b/>
+        </w:rPr>
+        <w:t>Code → Download ZIP</w:t>
+      </w:r>
+    </w:p>
+    <w:p>
+      <w:r>
+        <w:t xml:space="preserve">  and unzip it.</w:t>
+      </w:r>
+    </w:p>
+    <w:p>
+      <w:r>
+        <w:rPr>
+          <w:b/>
+        </w:rPr>
+        <w:t>Step 2 — install.</w:t>
+      </w:r>
+      <w:r>
+        <w:t xml:space="preserve"> From the project folder:</w:t>
+      </w:r>
+    </w:p>
+    <w:p>
+      <w:pPr>
+        <w:shd w:val="clear" w:fill="EFEAE3"/>
+      </w:pPr>
+      <w:r>
+        <w:rPr>
+          <w:rFonts w:ascii="Consolas" w:hAnsi="Consolas"/>
+          <w:sz w:val="16"/>
+        </w:rPr>
+        <w:t>cd paraqualis-skills</w:t>
+        <w:br/>
+        <w:t>./install.sh          # or:  bash install.sh   (use this if it isn't executable, e.g. from a ZIP)</w:t>
+      </w:r>
+    </w:p>
+    <w:p>
+      <w:r>
+        <w:t>This symlinks the commands, skills, and sub-agents into `~/.claude/`. Re-run it any time</w:t>
+      </w:r>
+    </w:p>
+    <w:p>
+      <w:r>
+        <w:t>you pull updates or add a new command family / skill / agent.</w:t>
+      </w:r>
+    </w:p>
+    <w:p>
+      <w:r>
+        <w:rPr>
+          <w:b/>
+        </w:rPr>
+        <w:t>Step 3 — restart Claude Code</w:t>
+      </w:r>
+      <w:r>
+        <w:t xml:space="preserve"> so it registers them. Confirm with `/` → `/qualify` appears.</w:t>
+      </w:r>
+    </w:p>
+    <w:p>
+      <w:r>
+        <w:rPr>
+          <w:b/>
+        </w:rPr>
+        <w:t>Optional — Word/Excel output:</w:t>
+      </w:r>
+      <w:r>
+        <w:t xml:space="preserve"> `pip install python-docx openpyxl`. Markdown and the test</w:t>
+      </w:r>
+    </w:p>
+    <w:p>
+      <w:r>
+        <w:t>scripts work without them.</w:t>
       </w:r>
     </w:p>
     <w:p>

</xml_diff>

<commit_message>
Default qualification pack to <project>/Qualification/ (in-project), not a sibling
The pack's natural home is inside the project being qualified — it versions with the
system, travels for hand-off, and sits where the gap-loop runs. Clarify the distinction:
agents examine read-only and modify no existing files; the pack is a NEW folder added
alongside (not "modifying the system"). A detached output location can still be specified.
Updated protocol, /qualify, and the user guide (+ regenerated Word).

Co-Authored-By: Claude Opus 4.7 (1M context) <noreply@anthropic.com>
</commit_message>
<xml_diff>
--- a/docs/how-to-qualify.docx
+++ b/docs/how-to-qualify.docx
@@ -659,7 +659,33 @@
     </w:p>
     <w:p>
       <w:r>
-        <w:t>A standalone `Qualification/` folder (the system under test is never modified):</w:t>
+        <w:t xml:space="preserve">By default a `Qualification/` folder is created </w:t>
+      </w:r>
+      <w:r>
+        <w:rPr>
+          <w:b/>
+        </w:rPr>
+        <w:t>inside the project you qualified</w:t>
+      </w:r>
+    </w:p>
+    <w:p>
+      <w:r>
+        <w:t>(`&lt;project&gt;/Qualification/`), so it lives and versions with the system and sits where the</w:t>
+      </w:r>
+    </w:p>
+    <w:p>
+      <w:r>
+        <w:t>gap-loop needs it. The engine *examines* the system read-only and modifies **no existing</w:t>
+      </w:r>
+    </w:p>
+    <w:p>
+      <w:r>
+        <w:t>files** — it only adds this new folder. (Point it elsewhere if you want a detached</w:t>
+      </w:r>
+    </w:p>
+    <w:p>
+      <w:r>
+        <w:t>deliverable.) It contains:</w:t>
       </w:r>
     </w:p>
     <w:p>

</xml_diff>

<commit_message>
Make explicit: engine writes ONLY Qualification/, never tests/ or validation/
It reads tests/, validation/, specs, config if present (as evidence); their absence is a
discovered finding, never assumed and never auto-created (no test suite -> OQ gap; no
documented use cases -> PQ authors them in the pack). Generated scripts live in
Qualification/scripts/, not injected into the system's test tree. Protocol + OQ agent +
user guide updated (+ regenerated Word).

Co-Authored-By: Claude Opus 4.7 (1M context) <noreply@anthropic.com>
</commit_message>
<xml_diff>
--- a/docs/how-to-qualify.docx
+++ b/docs/how-to-qualify.docx
@@ -1013,6 +1013,35 @@
         <w:rPr>
           <w:b/>
         </w:rPr>
+        <w:t>Writes only the `Qualification/` folder</w:t>
+      </w:r>
+      <w:r>
+        <w:t xml:space="preserve"> — never your `tests/`, `validation/`,</w:t>
+      </w:r>
+    </w:p>
+    <w:p>
+      <w:r>
+        <w:t xml:space="preserve">  source, or config. It *reads* those if present (as evidence) and treats their **absence</w:t>
+      </w:r>
+    </w:p>
+    <w:p>
+      <w:r>
+        <w:t xml:space="preserve">  as a finding, not an error** — it won't create them. Generated scripts live in</w:t>
+      </w:r>
+    </w:p>
+    <w:p>
+      <w:r>
+        <w:t xml:space="preserve">  `Qualification/scripts/`, not in your test tree.</w:t>
+      </w:r>
+    </w:p>
+    <w:p>
+      <w:pPr>
+        <w:pStyle w:val="ListBullet"/>
+      </w:pPr>
+      <w:r>
+        <w:rPr>
+          <w:b/>
+        </w:rPr>
         <w:t>Draft, traceable, approval-gated</w:t>
       </w:r>
       <w:r>

</xml_diff>

<commit_message>
Word builder: landscape + consistent explicit type scale
The .docx looked erratic because it used Word's built-in Heading/Title styles (sizes
vary wildly by template) mixed with ad-hoc run sizes, in portrait (too narrow for the
wide test-case tables). Now: landscape, and one explicit scale applied to every run —
body 10 / H 12-14-18 / table 9 / code 8.5pt — no built-in styles. Also skips --- rules.

Co-Authored-By: Claude Opus 4.7 (1M context) <noreply@anthropic.com>
</commit_message>
<xml_diff>
--- a/docs/how-to-qualify.docx
+++ b/docs/how-to-qualify.docx
@@ -4,41 +4,60 @@
   <w:body>
     <w:p>
       <w:pPr>
-        <w:pStyle w:val="Title"/>
+        <w:keepNext/>
+        <w:spacing w:before="200" w:after="80"/>
       </w:pPr>
       <w:r>
         <w:rPr>
+          <w:b/>
           <w:color w:val="276BB2"/>
+          <w:sz w:val="36"/>
         </w:rPr>
         <w:t>How to Qualify Any Application — ParaQualis xQ Engine</w:t>
       </w:r>
     </w:p>
     <w:p>
       <w:r>
+        <w:rPr>
+          <w:sz w:val="20"/>
+        </w:rPr>
         <w:t>*Author: ParaQualis LLC · © 2026 ParaQualis LLC · Licensed under the MIT License.*</w:t>
       </w:r>
     </w:p>
     <w:p>
       <w:r>
+        <w:rPr>
+          <w:sz w:val="20"/>
+        </w:rPr>
         <w:t xml:space="preserve">A practical guide to producing a draft </w:t>
       </w:r>
       <w:r>
         <w:rPr>
           <w:b/>
+          <w:sz w:val="20"/>
         </w:rPr>
         <w:t>IQ / OQ / PQ qualification package</w:t>
       </w:r>
       <w:r>
+        <w:rPr>
+          <w:sz w:val="20"/>
+        </w:rPr>
         <w:t xml:space="preserve"> for any</w:t>
       </w:r>
     </w:p>
     <w:p>
       <w:r>
+        <w:rPr>
+          <w:sz w:val="20"/>
+        </w:rPr>
         <w:t>application using the ParaQualis xQ engine in Claude Code. The engine examines the system,</w:t>
       </w:r>
     </w:p>
     <w:p>
       <w:r>
+        <w:rPr>
+          <w:sz w:val="20"/>
+        </w:rPr>
         <w:t>fans out to three specialist sub-agents in parallel, and assembles a client-ready pack in</w:t>
       </w:r>
     </w:p>
@@ -46,10 +65,14 @@
       <w:r>
         <w:rPr>
           <w:b/>
+          <w:sz w:val="20"/>
         </w:rPr>
         <w:t>Markdown, Word, and Excel</w:t>
       </w:r>
       <w:r>
+        <w:rPr>
+          <w:sz w:val="20"/>
+        </w:rPr>
         <w:t>, plus executable test scripts and a gap register.</w:t>
       </w:r>
     </w:p>
@@ -59,10 +82,33 @@
       </w:pPr>
       <w:r>
         <w:rPr>
-          <w:i/>
+          <w:b/>
           <w:color w:val="81A5C1"/>
+          <w:sz w:val="20"/>
         </w:rPr>
-        <w:t>**Read this first.** The output is **draft evidence**, not a sign-off. It is reviewed and</w:t>
+        <w:t>Read this first.</w:t>
+      </w:r>
+      <w:r>
+        <w:rPr>
+          <w:color w:val="81A5C1"/>
+          <w:sz w:val="20"/>
+        </w:rPr>
+        <w:t xml:space="preserve"> The output is </w:t>
+      </w:r>
+      <w:r>
+        <w:rPr>
+          <w:b/>
+          <w:color w:val="81A5C1"/>
+          <w:sz w:val="20"/>
+        </w:rPr>
+        <w:t>draft evidence</w:t>
+      </w:r>
+      <w:r>
+        <w:rPr>
+          <w:color w:val="81A5C1"/>
+          <w:sz w:val="20"/>
+        </w:rPr>
+        <w:t>, not a sign-off. It is reviewed and</w:t>
       </w:r>
     </w:p>
     <w:p>
@@ -71,8 +117,8 @@
       </w:pPr>
       <w:r>
         <w:rPr>
-          <w:i/>
           <w:color w:val="81A5C1"/>
+          <w:sz w:val="20"/>
         </w:rPr>
         <w:t>executed by appropriately qualified and authorized personnel. The engine itself is a</w:t>
       </w:r>
@@ -83,8 +129,8 @@
       </w:pPr>
       <w:r>
         <w:rPr>
-          <w:i/>
           <w:color w:val="81A5C1"/>
+          <w:sz w:val="20"/>
         </w:rPr>
         <w:t>GxP-impacting tool that would require its own qualification before its output is relied</w:t>
       </w:r>
@@ -95,24 +141,22 @@
       </w:pPr>
       <w:r>
         <w:rPr>
-          <w:i/>
           <w:color w:val="81A5C1"/>
+          <w:sz w:val="20"/>
         </w:rPr>
         <w:t>upon as formal evidence. It accelerates and structures the work; it does not self-certify.</w:t>
       </w:r>
     </w:p>
     <w:p>
-      <w:r>
-        <w:t>---</w:t>
-      </w:r>
-    </w:p>
-    <w:p>
       <w:pPr>
-        <w:pStyle w:val="Heading1"/>
+        <w:keepNext/>
+        <w:spacing w:before="200" w:after="80"/>
       </w:pPr>
       <w:r>
         <w:rPr>
+          <w:b/>
           <w:color w:val="276BB2"/>
+          <w:sz w:val="28"/>
         </w:rPr>
         <w:t>1. One-time setup (per machine)</w:t>
       </w:r>
@@ -121,15 +165,22 @@
       <w:r>
         <w:rPr>
           <w:b/>
+          <w:sz w:val="20"/>
         </w:rPr>
         <w:t>Step 1 — get the files.</w:t>
       </w:r>
       <w:r>
+        <w:rPr>
+          <w:sz w:val="20"/>
+        </w:rPr>
         <w:t xml:space="preserve"> Use whichever route your access allows. *(The repository is</w:t>
       </w:r>
     </w:p>
     <w:p>
       <w:r>
+        <w:rPr>
+          <w:sz w:val="20"/>
+        </w:rPr>
         <w:t>private — you must first be granted access by ParaQualis, or use a copy they provide.)*</w:t>
       </w:r>
     </w:p>
@@ -140,15 +191,22 @@
       <w:r>
         <w:rPr>
           <w:b/>
+          <w:sz w:val="20"/>
         </w:rPr>
         <w:t>SSH</w:t>
       </w:r>
       <w:r>
+        <w:rPr>
+          <w:sz w:val="20"/>
+        </w:rPr>
         <w:t xml:space="preserve"> (collaborators with an SSH key on the repo):</w:t>
       </w:r>
     </w:p>
     <w:p>
       <w:r>
+        <w:rPr>
+          <w:sz w:val="20"/>
+        </w:rPr>
         <w:t xml:space="preserve">  `git clone git@github.com:DeepJam/paraqualis-skills.git`</w:t>
       </w:r>
     </w:p>
@@ -159,15 +217,22 @@
       <w:r>
         <w:rPr>
           <w:b/>
+          <w:sz w:val="20"/>
         </w:rPr>
         <w:t>HTTPS</w:t>
       </w:r>
       <w:r>
+        <w:rPr>
+          <w:sz w:val="20"/>
+        </w:rPr>
         <w:t xml:space="preserve"> (collaborators — prompts for a GitHub token/login):</w:t>
       </w:r>
     </w:p>
     <w:p>
       <w:r>
+        <w:rPr>
+          <w:sz w:val="20"/>
+        </w:rPr>
         <w:t xml:space="preserve">  `git clone https://github.com/DeepJam/paraqualis-skills.git`</w:t>
       </w:r>
     </w:p>
@@ -178,21 +243,29 @@
       <w:r>
         <w:rPr>
           <w:b/>
+          <w:sz w:val="20"/>
         </w:rPr>
         <w:t>No git, or no access configured:</w:t>
       </w:r>
       <w:r>
+        <w:rPr>
+          <w:sz w:val="20"/>
+        </w:rPr>
         <w:t xml:space="preserve"> on the GitHub page choose </w:t>
       </w:r>
       <w:r>
         <w:rPr>
           <w:b/>
+          <w:sz w:val="20"/>
         </w:rPr>
         <w:t>Code → Download ZIP</w:t>
       </w:r>
     </w:p>
     <w:p>
       <w:r>
+        <w:rPr>
+          <w:sz w:val="20"/>
+        </w:rPr>
         <w:t xml:space="preserve">  and unzip it.</w:t>
       </w:r>
     </w:p>
@@ -200,10 +273,14 @@
       <w:r>
         <w:rPr>
           <w:b/>
+          <w:sz w:val="20"/>
         </w:rPr>
         <w:t>Step 2 — install.</w:t>
       </w:r>
       <w:r>
+        <w:rPr>
+          <w:sz w:val="20"/>
+        </w:rPr>
         <w:t xml:space="preserve"> From the project folder:</w:t>
       </w:r>
     </w:p>
@@ -214,7 +291,7 @@
       <w:r>
         <w:rPr>
           <w:rFonts w:ascii="Consolas" w:hAnsi="Consolas"/>
-          <w:sz w:val="16"/>
+          <w:sz w:val="17"/>
         </w:rPr>
         <w:t>cd paraqualis-skills</w:t>
         <w:br/>
@@ -223,11 +300,17 @@
     </w:p>
     <w:p>
       <w:r>
+        <w:rPr>
+          <w:sz w:val="20"/>
+        </w:rPr>
         <w:t>This symlinks the commands, skills, and sub-agents into `~/.claude/`. Re-run it any time</w:t>
       </w:r>
     </w:p>
     <w:p>
       <w:r>
+        <w:rPr>
+          <w:sz w:val="20"/>
+        </w:rPr>
         <w:t>you pull updates or add a new command family / skill / agent.</w:t>
       </w:r>
     </w:p>
@@ -235,10 +318,14 @@
       <w:r>
         <w:rPr>
           <w:b/>
+          <w:sz w:val="20"/>
         </w:rPr>
         <w:t>Step 3 — restart Claude Code</w:t>
       </w:r>
       <w:r>
+        <w:rPr>
+          <w:sz w:val="20"/>
+        </w:rPr>
         <w:t xml:space="preserve"> so it registers them. Confirm with `/` → `/qualify` appears.</w:t>
       </w:r>
     </w:p>
@@ -246,56 +333,76 @@
       <w:r>
         <w:rPr>
           <w:b/>
+          <w:sz w:val="20"/>
         </w:rPr>
         <w:t>Optional — Word/Excel output:</w:t>
       </w:r>
       <w:r>
+        <w:rPr>
+          <w:sz w:val="20"/>
+        </w:rPr>
         <w:t xml:space="preserve"> `pip install python-docx openpyxl`. Markdown and the test</w:t>
       </w:r>
     </w:p>
     <w:p>
       <w:r>
+        <w:rPr>
+          <w:sz w:val="20"/>
+        </w:rPr>
         <w:t>scripts work without them.</w:t>
       </w:r>
     </w:p>
     <w:p>
       <w:r>
+        <w:rPr>
+          <w:sz w:val="20"/>
+        </w:rPr>
         <w:t>No assumptions are made about the application's technology: the engine discovers the</w:t>
       </w:r>
     </w:p>
     <w:p>
       <w:r>
+        <w:rPr>
+          <w:sz w:val="20"/>
+        </w:rPr>
         <w:t>language, runtime, databases (zero, one, or many — of any type), and services itself.</w:t>
       </w:r>
     </w:p>
     <w:p>
-      <w:r>
-        <w:t>---</w:t>
-      </w:r>
-    </w:p>
-    <w:p>
       <w:pPr>
-        <w:pStyle w:val="Heading1"/>
+        <w:keepNext/>
+        <w:spacing w:before="200" w:after="80"/>
       </w:pPr>
       <w:r>
         <w:rPr>
+          <w:b/>
           <w:color w:val="276BB2"/>
+          <w:sz w:val="28"/>
         </w:rPr>
         <w:t>2. What to tell the Claude helping you with the application</w:t>
       </w:r>
     </w:p>
     <w:p>
       <w:r>
+        <w:rPr>
+          <w:sz w:val="20"/>
+        </w:rPr>
         <w:t>Run `/qualify` from a Claude Code session that can see the application. To get grounded,</w:t>
       </w:r>
     </w:p>
     <w:p>
       <w:r>
+        <w:rPr>
+          <w:sz w:val="20"/>
+        </w:rPr>
         <w:t>auditable output, give Claude this context first (the more it knows, the less it has to</w:t>
       </w:r>
     </w:p>
     <w:p>
       <w:r>
+        <w:rPr>
+          <w:sz w:val="20"/>
+        </w:rPr>
         <w:t>assume — and qualification tests are *sourced from the specification*, never invented):</w:t>
       </w:r>
     </w:p>
@@ -306,10 +413,14 @@
       <w:r>
         <w:rPr>
           <w:b/>
+          <w:sz w:val="20"/>
         </w:rPr>
         <w:t>Where the system is</w:t>
       </w:r>
       <w:r>
+        <w:rPr>
+          <w:sz w:val="20"/>
+        </w:rPr>
         <w:t xml:space="preserve"> — the repo path and, if useful, how to reach the running app.</w:t>
       </w:r>
     </w:p>
@@ -320,10 +431,14 @@
       <w:r>
         <w:rPr>
           <w:b/>
+          <w:sz w:val="20"/>
         </w:rPr>
         <w:t>Intended use &amp; GxP context</w:t>
       </w:r>
       <w:r>
+        <w:rPr>
+          <w:sz w:val="20"/>
+        </w:rPr>
         <w:t xml:space="preserve"> — what the system is for and why it matters.</w:t>
       </w:r>
     </w:p>
@@ -334,15 +449,22 @@
       <w:r>
         <w:rPr>
           <w:b/>
+          <w:sz w:val="20"/>
         </w:rPr>
         <w:t>Regulatory scope</w:t>
       </w:r>
       <w:r>
+        <w:rPr>
+          <w:sz w:val="20"/>
+        </w:rPr>
         <w:t xml:space="preserve"> — which apply: 21 CFR Part 11, EU GMP Annex 11, GAMP 5, AI/ML</w:t>
       </w:r>
     </w:p>
     <w:p>
       <w:r>
+        <w:rPr>
+          <w:sz w:val="20"/>
+        </w:rPr>
         <w:t xml:space="preserve">  guidance (FDA / ISPE GAMP AI / EU Annex 22).</w:t>
       </w:r>
     </w:p>
@@ -353,20 +475,30 @@
       <w:r>
         <w:rPr>
           <w:b/>
+          <w:sz w:val="20"/>
         </w:rPr>
         <w:t>Where the specification lives</w:t>
       </w:r>
       <w:r>
+        <w:rPr>
+          <w:sz w:val="20"/>
+        </w:rPr>
         <w:t xml:space="preserve"> — URS, functional/design specs, configuration</w:t>
       </w:r>
     </w:p>
     <w:p>
       <w:r>
+        <w:rPr>
+          <w:sz w:val="20"/>
+        </w:rPr>
         <w:t xml:space="preserve">  baselines. Expected values (versions, schema, thresholds) are read from the spec or the</w:t>
       </w:r>
     </w:p>
     <w:p>
       <w:r>
+        <w:rPr>
+          <w:sz w:val="20"/>
+        </w:rPr>
         <w:t xml:space="preserve">  system's own declarations (Dockerfile, lockfiles, migrations) — so point Claude at them.</w:t>
       </w:r>
     </w:p>
@@ -377,44 +509,56 @@
       <w:r>
         <w:rPr>
           <w:b/>
+          <w:sz w:val="20"/>
         </w:rPr>
         <w:t>Any existing qualification pack</w:t>
       </w:r>
       <w:r>
+        <w:rPr>
+          <w:sz w:val="20"/>
+        </w:rPr>
         <w:t xml:space="preserve"> to verify against (enables *verify mode*, below).</w:t>
       </w:r>
     </w:p>
     <w:p>
       <w:r>
+        <w:rPr>
+          <w:sz w:val="20"/>
+        </w:rPr>
         <w:t xml:space="preserve">You do </w:t>
       </w:r>
       <w:r>
         <w:rPr>
           <w:b/>
+          <w:sz w:val="20"/>
         </w:rPr>
         <w:t>not</w:t>
       </w:r>
       <w:r>
+        <w:rPr>
+          <w:sz w:val="20"/>
+        </w:rPr>
         <w:t xml:space="preserve"> need to list the tech stack or databases — the engine detects them. Telling</w:t>
       </w:r>
     </w:p>
     <w:p>
       <w:r>
+        <w:rPr>
+          <w:sz w:val="20"/>
+        </w:rPr>
         <w:t>it anyway does no harm.</w:t>
       </w:r>
     </w:p>
     <w:p>
-      <w:r>
-        <w:t>---</w:t>
-      </w:r>
-    </w:p>
-    <w:p>
       <w:pPr>
-        <w:pStyle w:val="Heading1"/>
+        <w:keepNext/>
+        <w:spacing w:before="200" w:after="80"/>
       </w:pPr>
       <w:r>
         <w:rPr>
+          <w:b/>
           <w:color w:val="276BB2"/>
+          <w:sz w:val="28"/>
         </w:rPr>
         <w:t>3. How to trigger it</w:t>
       </w:r>
@@ -423,6 +567,7 @@
       <w:r>
         <w:rPr>
           <w:b/>
+          <w:sz w:val="20"/>
         </w:rPr>
         <w:t>Generate a new pack:</w:t>
       </w:r>
@@ -434,7 +579,7 @@
       <w:r>
         <w:rPr>
           <w:rFonts w:ascii="Consolas" w:hAnsi="Consolas"/>
-          <w:sz w:val="16"/>
+          <w:sz w:val="17"/>
         </w:rPr>
         <w:t>/qualify &lt;path-to-the-application&gt;</w:t>
       </w:r>
@@ -443,15 +588,22 @@
       <w:r>
         <w:rPr>
           <w:b/>
+          <w:sz w:val="20"/>
         </w:rPr>
         <w:t>Verify an existing pack</w:t>
       </w:r>
       <w:r>
+        <w:rPr>
+          <w:sz w:val="20"/>
+        </w:rPr>
         <w:t xml:space="preserve"> (pre-checks the items it can substantiate, leaves the rest for</w:t>
       </w:r>
     </w:p>
     <w:p>
       <w:r>
+        <w:rPr>
+          <w:sz w:val="20"/>
+        </w:rPr>
         <w:t>human sign-off):</w:t>
       </w:r>
     </w:p>
@@ -462,48 +614,59 @@
       <w:r>
         <w:rPr>
           <w:rFonts w:ascii="Consolas" w:hAnsi="Consolas"/>
-          <w:sz w:val="16"/>
+          <w:sz w:val="17"/>
         </w:rPr>
         <w:t>/qualify &lt;path-to-the-application&gt;   (then reference the existing qualification pack)</w:t>
       </w:r>
     </w:p>
     <w:p>
-      <w:r>
-        <w:t>---</w:t>
-      </w:r>
-    </w:p>
-    <w:p>
       <w:pPr>
-        <w:pStyle w:val="Heading1"/>
+        <w:keepNext/>
+        <w:spacing w:before="200" w:after="80"/>
       </w:pPr>
       <w:r>
         <w:rPr>
+          <w:b/>
           <w:color w:val="276BB2"/>
+          <w:sz w:val="28"/>
         </w:rPr>
         <w:t>4. What happens, and what to expect</w:t>
       </w:r>
     </w:p>
     <w:p>
       <w:r>
+        <w:rPr>
+          <w:sz w:val="20"/>
+        </w:rPr>
         <w:t>1. The orchestrator does a quick scan of the application to scope each stage.</w:t>
       </w:r>
     </w:p>
     <w:p>
       <w:r>
+        <w:rPr>
+          <w:sz w:val="20"/>
+        </w:rPr>
         <w:t xml:space="preserve">2. It </w:t>
       </w:r>
       <w:r>
         <w:rPr>
           <w:b/>
+          <w:sz w:val="20"/>
         </w:rPr>
         <w:t>fans out to three sub-agents in parallel</w:t>
       </w:r>
       <w:r>
+        <w:rPr>
+          <w:sz w:val="20"/>
+        </w:rPr>
         <w:t xml:space="preserve"> — `iq-qualifier`, `oq-qualifier`,</w:t>
       </w:r>
     </w:p>
     <w:p>
       <w:r>
+        <w:rPr>
+          <w:sz w:val="20"/>
+        </w:rPr>
         <w:t xml:space="preserve">   `pq-qualifier` — each examining its slice in its own context:</w:t>
       </w:r>
     </w:p>
@@ -514,24 +677,35 @@
       <w:r>
         <w:rPr>
           <w:b/>
+          <w:sz w:val="20"/>
         </w:rPr>
         <w:t>IQ</w:t>
       </w:r>
       <w:r>
+        <w:rPr>
+          <w:sz w:val="20"/>
+        </w:rPr>
         <w:t xml:space="preserve"> — is it installed/configured correctly? tech stack, </w:t>
       </w:r>
       <w:r>
         <w:rPr>
           <w:b/>
+          <w:sz w:val="20"/>
         </w:rPr>
         <w:t>database schema(s)</w:t>
       </w:r>
       <w:r>
+        <w:rPr>
+          <w:sz w:val="20"/>
+        </w:rPr>
         <w:t>,</w:t>
       </w:r>
     </w:p>
     <w:p>
       <w:r>
+        <w:rPr>
+          <w:sz w:val="20"/>
+        </w:rPr>
         <w:t xml:space="preserve">     required seed/reference data, boot configuration.</w:t>
       </w:r>
     </w:p>
@@ -542,47 +716,69 @@
       <w:r>
         <w:rPr>
           <w:b/>
+          <w:sz w:val="20"/>
         </w:rPr>
         <w:t>OQ</w:t>
       </w:r>
       <w:r>
+        <w:rPr>
+          <w:sz w:val="20"/>
+        </w:rPr>
         <w:t xml:space="preserve"> — does it operate per spec? functions, </w:t>
       </w:r>
       <w:r>
         <w:rPr>
           <w:b/>
+          <w:sz w:val="20"/>
         </w:rPr>
         <w:t>unit-test evidence</w:t>
       </w:r>
       <w:r>
+        <w:rPr>
+          <w:sz w:val="20"/>
+        </w:rPr>
         <w:t>, edge &amp; error</w:t>
       </w:r>
     </w:p>
     <w:p>
       <w:r>
+        <w:rPr>
+          <w:sz w:val="20"/>
+        </w:rPr>
         <w:t xml:space="preserve">     conditions, </w:t>
       </w:r>
       <w:r>
         <w:rPr>
           <w:b/>
+          <w:sz w:val="20"/>
         </w:rPr>
         <w:t>audit trails</w:t>
       </w:r>
       <w:r>
+        <w:rPr>
+          <w:sz w:val="20"/>
+        </w:rPr>
         <w:t xml:space="preserve">, </w:t>
       </w:r>
       <w:r>
         <w:rPr>
           <w:b/>
+          <w:sz w:val="20"/>
         </w:rPr>
         <w:t>electronic signatures/sign-offs</w:t>
       </w:r>
       <w:r>
+        <w:rPr>
+          <w:sz w:val="20"/>
+        </w:rPr>
         <w:t>, dependency</w:t>
       </w:r>
     </w:p>
     <w:p>
       <w:r>
+        <w:rPr>
+          <w:sz w:val="20"/>
+        </w:rPr>
         <w:t xml:space="preserve">     handling (must fail loud, never silently), minimum configuration to *use* the system.</w:t>
       </w:r>
     </w:p>
@@ -593,25 +789,38 @@
       <w:r>
         <w:rPr>
           <w:b/>
+          <w:sz w:val="20"/>
         </w:rPr>
         <w:t>PQ</w:t>
       </w:r>
       <w:r>
+        <w:rPr>
+          <w:sz w:val="20"/>
+        </w:rPr>
         <w:t xml:space="preserve"> — does it do its job? intended-use workflows, requirements traceability, and —</w:t>
       </w:r>
     </w:p>
     <w:p>
       <w:r>
+        <w:rPr>
+          <w:sz w:val="20"/>
+        </w:rPr>
         <w:t xml:space="preserve">     for AI/ML systems — consistency, drift, and (for LLMs) hallucination, with defined</w:t>
       </w:r>
     </w:p>
     <w:p>
       <w:r>
+        <w:rPr>
+          <w:sz w:val="20"/>
+        </w:rPr>
         <w:t xml:space="preserve">     acceptance outcomes.</w:t>
       </w:r>
     </w:p>
     <w:p>
       <w:r>
+        <w:rPr>
+          <w:sz w:val="20"/>
+        </w:rPr>
         <w:t>3. The orchestrator assembles everything into one consolidated pack.</w:t>
       </w:r>
     </w:p>
@@ -619,72 +828,99 @@
       <w:r>
         <w:rPr>
           <w:b/>
+          <w:sz w:val="20"/>
         </w:rPr>
         <w:t>Expect a DRAFT.</w:t>
       </w:r>
       <w:r>
+        <w:rPr>
+          <w:sz w:val="20"/>
+        </w:rPr>
         <w:t xml:space="preserve"> The test scripts are *draft instruments* derived from examining the</w:t>
       </w:r>
     </w:p>
     <w:p>
       <w:r>
+        <w:rPr>
+          <w:sz w:val="20"/>
+        </w:rPr>
         <w:t>system; you then run them against the live system, and some will need adjustment against</w:t>
       </w:r>
     </w:p>
     <w:p>
       <w:r>
+        <w:rPr>
+          <w:sz w:val="20"/>
+        </w:rPr>
         <w:t>what actually executes. That iteration is the qualification work. **The genuine test of the</w:t>
       </w:r>
     </w:p>
     <w:p>
       <w:r>
+        <w:rPr>
+          <w:sz w:val="20"/>
+        </w:rPr>
         <w:t>system is running the scripts** — reading code is necessarily partial.</w:t>
       </w:r>
     </w:p>
     <w:p>
-      <w:r>
-        <w:t>---</w:t>
-      </w:r>
-    </w:p>
-    <w:p>
       <w:pPr>
-        <w:pStyle w:val="Heading1"/>
+        <w:keepNext/>
+        <w:spacing w:before="200" w:after="80"/>
       </w:pPr>
       <w:r>
         <w:rPr>
+          <w:b/>
           <w:color w:val="276BB2"/>
+          <w:sz w:val="28"/>
         </w:rPr>
         <w:t>5. What you get — the `Qualification/` directory</w:t>
       </w:r>
     </w:p>
     <w:p>
       <w:r>
+        <w:rPr>
+          <w:sz w:val="20"/>
+        </w:rPr>
         <w:t xml:space="preserve">By default a `Qualification/` folder is created </w:t>
       </w:r>
       <w:r>
         <w:rPr>
           <w:b/>
+          <w:sz w:val="20"/>
         </w:rPr>
         <w:t>inside the project you qualified</w:t>
       </w:r>
     </w:p>
     <w:p>
       <w:r>
+        <w:rPr>
+          <w:sz w:val="20"/>
+        </w:rPr>
         <w:t>(`&lt;project&gt;/Qualification/`), so it lives and versions with the system and sits where the</w:t>
       </w:r>
     </w:p>
     <w:p>
       <w:r>
+        <w:rPr>
+          <w:sz w:val="20"/>
+        </w:rPr>
         <w:t>gap-loop needs it. The engine *examines* the system read-only and modifies **no existing</w:t>
       </w:r>
     </w:p>
     <w:p>
       <w:r>
+        <w:rPr>
+          <w:sz w:val="20"/>
+        </w:rPr>
         <w:t>files** — it only adds this new folder. (Point it elsewhere if you want a detached</w:t>
       </w:r>
     </w:p>
     <w:p>
       <w:r>
+        <w:rPr>
+          <w:sz w:val="20"/>
+        </w:rPr>
         <w:t>deliverable.) It contains:</w:t>
       </w:r>
     </w:p>
@@ -695,7 +931,7 @@
       <w:r>
         <w:rPr>
           <w:rFonts w:ascii="Consolas" w:hAnsi="Consolas"/>
-          <w:sz w:val="16"/>
+          <w:sz w:val="17"/>
         </w:rPr>
         <w:t>Qualification/</w:t>
         <w:br/>
@@ -732,57 +968,85 @@
       <w:r>
         <w:rPr>
           <w:b/>
+          <w:sz w:val="20"/>
         </w:rPr>
         <w:t>Every qualification item is a test-case</w:t>
       </w:r>
       <w:r>
+        <w:rPr>
+          <w:sz w:val="20"/>
+        </w:rPr>
         <w:t xml:space="preserve"> with: an ID (`IQ-/OQ-/PQ-NNN`, `-AI-` for</w:t>
       </w:r>
     </w:p>
     <w:p>
       <w:r>
+        <w:rPr>
+          <w:sz w:val="20"/>
+        </w:rPr>
         <w:t xml:space="preserve">AI-specific), the </w:t>
       </w:r>
       <w:r>
         <w:rPr>
           <w:b/>
+          <w:sz w:val="20"/>
         </w:rPr>
         <w:t>requirement</w:t>
       </w:r>
       <w:r>
+        <w:rPr>
+          <w:sz w:val="20"/>
+        </w:rPr>
         <w:t xml:space="preserve">, the regulatory linkage, the </w:t>
       </w:r>
       <w:r>
         <w:rPr>
           <w:b/>
+          <w:sz w:val="20"/>
         </w:rPr>
         <w:t>executable test</w:t>
       </w:r>
       <w:r>
+        <w:rPr>
+          <w:sz w:val="20"/>
+        </w:rPr>
         <w:t xml:space="preserve"> (a</w:t>
       </w:r>
     </w:p>
     <w:p>
       <w:r>
+        <w:rPr>
+          <w:sz w:val="20"/>
+        </w:rPr>
         <w:t>script in `scripts/`, or a manual procedure where it can't be scripted — UI tests usually</w:t>
       </w:r>
     </w:p>
     <w:p>
       <w:r>
+        <w:rPr>
+          <w:sz w:val="20"/>
+        </w:rPr>
         <w:t xml:space="preserve">are manual), the </w:t>
       </w:r>
       <w:r>
         <w:rPr>
           <w:b/>
+          <w:sz w:val="20"/>
         </w:rPr>
         <w:t>acceptance criteria</w:t>
       </w:r>
       <w:r>
+        <w:rPr>
+          <w:sz w:val="20"/>
+        </w:rPr>
         <w:t>, the expected result, and a blank **execution</w:t>
       </w:r>
     </w:p>
     <w:p>
       <w:r>
+        <w:rPr>
+          <w:sz w:val="20"/>
+        </w:rPr>
         <w:t>record** to complete when run.</w:t>
       </w:r>
     </w:p>
@@ -790,33 +1054,48 @@
       <w:r>
         <w:rPr>
           <w:b/>
+          <w:sz w:val="20"/>
         </w:rPr>
         <w:t>Formats:</w:t>
       </w:r>
       <w:r>
+        <w:rPr>
+          <w:sz w:val="20"/>
+        </w:rPr>
         <w:t xml:space="preserve"> Markdown is the </w:t>
       </w:r>
       <w:r>
         <w:rPr>
           <w:b/>
+          <w:sz w:val="20"/>
         </w:rPr>
         <w:t>source of truth</w:t>
       </w:r>
       <w:r>
+        <w:rPr>
+          <w:sz w:val="20"/>
+        </w:rPr>
         <w:t>. Word (branded, authored by ParaQualis</w:t>
       </w:r>
     </w:p>
     <w:p>
       <w:r>
+        <w:rPr>
+          <w:sz w:val="20"/>
+        </w:rPr>
         <w:t xml:space="preserve">LLC) and Excel are </w:t>
       </w:r>
       <w:r>
         <w:rPr>
           <w:b/>
+          <w:sz w:val="20"/>
         </w:rPr>
         <w:t>generated</w:t>
       </w:r>
       <w:r>
+        <w:rPr>
+          <w:sz w:val="20"/>
+        </w:rPr>
         <w:t xml:space="preserve"> — never hand-edit them. After editing any `.md`, rebuild:</w:t>
       </w:r>
     </w:p>
@@ -827,66 +1106,85 @@
       <w:r>
         <w:rPr>
           <w:rFonts w:ascii="Consolas" w:hAnsi="Consolas"/>
-          <w:sz w:val="16"/>
+          <w:sz w:val="17"/>
         </w:rPr>
         <w:t>cd Qualification &amp;&amp; python3 build_docx.py &amp;&amp; python3 build_xlsx.py</w:t>
       </w:r>
     </w:p>
     <w:p>
-      <w:r>
-        <w:t>---</w:t>
-      </w:r>
-    </w:p>
-    <w:p>
       <w:pPr>
-        <w:pStyle w:val="Heading1"/>
+        <w:keepNext/>
+        <w:spacing w:before="200" w:after="80"/>
       </w:pPr>
       <w:r>
         <w:rPr>
+          <w:b/>
           <w:color w:val="276BB2"/>
+          <w:sz w:val="28"/>
         </w:rPr>
         <w:t>6. Closing the gaps (the loop)</w:t>
       </w:r>
     </w:p>
     <w:p>
       <w:r>
+        <w:rPr>
+          <w:sz w:val="20"/>
+        </w:rPr>
         <w:t xml:space="preserve">`docs/Gap-Analysis.md` is one file with two jobs: it is the auditable </w:t>
       </w:r>
       <w:r>
         <w:rPr>
           <w:b/>
+          <w:sz w:val="20"/>
         </w:rPr>
         <w:t>QA gap register</w:t>
       </w:r>
       <w:r>
+        <w:rPr>
+          <w:sz w:val="20"/>
+        </w:rPr>
         <w:t>,</w:t>
       </w:r>
     </w:p>
     <w:p>
       <w:r>
+        <w:rPr>
+          <w:sz w:val="20"/>
+        </w:rPr>
         <w:t xml:space="preserve">and it is the file you </w:t>
       </w:r>
       <w:r>
         <w:rPr>
           <w:b/>
+          <w:sz w:val="20"/>
         </w:rPr>
         <w:t>feed to Claude in the application's repo to close the gaps</w:t>
       </w:r>
       <w:r>
+        <w:rPr>
+          <w:sz w:val="20"/>
+        </w:rPr>
         <w:t>. Each</w:t>
       </w:r>
     </w:p>
     <w:p>
       <w:r>
+        <w:rPr>
+          <w:sz w:val="20"/>
+        </w:rPr>
         <w:t xml:space="preserve">gap row carries its </w:t>
       </w:r>
       <w:r>
         <w:rPr>
           <w:b/>
+          <w:sz w:val="20"/>
         </w:rPr>
         <w:t>definition of done = the test-case that must pass</w:t>
       </w:r>
       <w:r>
+        <w:rPr>
+          <w:sz w:val="20"/>
+        </w:rPr>
         <w:t>. So:</w:t>
       </w:r>
     </w:p>
@@ -897,7 +1195,7 @@
       <w:r>
         <w:rPr>
           <w:rFonts w:ascii="Consolas" w:hAnsi="Consolas"/>
-          <w:sz w:val="16"/>
+          <w:sz w:val="17"/>
         </w:rPr>
         <w:t>/qualify &lt;app&gt;            → tests + Gap-Analysis.md (each gap: fix + "done = test X passes")</w:t>
         <w:br/>
@@ -910,26 +1208,30 @@
     </w:p>
     <w:p>
       <w:r>
+        <w:rPr>
+          <w:sz w:val="20"/>
+        </w:rPr>
         <w:t>Remediation and evidence are the same chain: a gap is closed only when the test that found</w:t>
       </w:r>
     </w:p>
     <w:p>
       <w:r>
+        <w:rPr>
+          <w:sz w:val="20"/>
+        </w:rPr>
         <w:t>it passes — not on anyone's say-so.</w:t>
       </w:r>
     </w:p>
     <w:p>
-      <w:r>
-        <w:t>---</w:t>
-      </w:r>
-    </w:p>
-    <w:p>
       <w:pPr>
-        <w:pStyle w:val="Heading1"/>
+        <w:keepNext/>
+        <w:spacing w:before="200" w:after="80"/>
       </w:pPr>
       <w:r>
         <w:rPr>
+          <w:b/>
           <w:color w:val="276BB2"/>
+          <w:sz w:val="28"/>
         </w:rPr>
         <w:t>7. Principles the engine holds to (so you can trust the output)</w:t>
       </w:r>
@@ -941,15 +1243,22 @@
       <w:r>
         <w:rPr>
           <w:b/>
+          <w:sz w:val="20"/>
         </w:rPr>
         <w:t>No stack assumptions</w:t>
       </w:r>
       <w:r>
+        <w:rPr>
+          <w:sz w:val="20"/>
+        </w:rPr>
         <w:t xml:space="preserve"> — language, runtime, and databases (0/1/many, any type) are</w:t>
       </w:r>
     </w:p>
     <w:p>
       <w:r>
+        <w:rPr>
+          <w:sz w:val="20"/>
+        </w:rPr>
         <w:t xml:space="preserve">  discovered, not assumed; absence of a component is a valid finding, not a skipped test.</w:t>
       </w:r>
     </w:p>
@@ -960,15 +1269,22 @@
       <w:r>
         <w:rPr>
           <w:b/>
+          <w:sz w:val="20"/>
         </w:rPr>
         <w:t>Expected values are sourced, not invented</w:t>
       </w:r>
       <w:r>
+        <w:rPr>
+          <w:sz w:val="20"/>
+        </w:rPr>
         <w:t xml:space="preserve"> — read from the spec or the system's own</w:t>
       </w:r>
     </w:p>
     <w:p>
       <w:r>
+        <w:rPr>
+          <w:sz w:val="20"/>
+        </w:rPr>
         <w:t xml:space="preserve">  declarations and cited; never hardcoded literals.</w:t>
       </w:r>
     </w:p>
@@ -979,15 +1295,22 @@
       <w:r>
         <w:rPr>
           <w:b/>
+          <w:sz w:val="20"/>
         </w:rPr>
         <w:t>Honest evidence</w:t>
       </w:r>
       <w:r>
+        <w:rPr>
+          <w:sz w:val="20"/>
+        </w:rPr>
         <w:t xml:space="preserve"> — a skipped/unexecuted test is *not* a pass (skips are only for true</w:t>
       </w:r>
     </w:p>
     <w:p>
       <w:r>
+        <w:rPr>
+          <w:sz w:val="20"/>
+        </w:rPr>
         <w:t xml:space="preserve">  environment gates); errors are never swallowed silently.</w:t>
       </w:r>
     </w:p>
@@ -998,10 +1321,14 @@
       <w:r>
         <w:rPr>
           <w:b/>
+          <w:sz w:val="20"/>
         </w:rPr>
         <w:t>Deterministic on compliance-critical paths</w:t>
       </w:r>
       <w:r>
+        <w:rPr>
+          <w:sz w:val="20"/>
+        </w:rPr>
         <w:t xml:space="preserve"> — no "usually right" / magic-number logic.</w:t>
       </w:r>
     </w:p>
@@ -1012,25 +1339,38 @@
       <w:r>
         <w:rPr>
           <w:b/>
+          <w:sz w:val="20"/>
         </w:rPr>
         <w:t>Writes only the `Qualification/` folder</w:t>
       </w:r>
       <w:r>
+        <w:rPr>
+          <w:sz w:val="20"/>
+        </w:rPr>
         <w:t xml:space="preserve"> — never your `tests/`, `validation/`,</w:t>
       </w:r>
     </w:p>
     <w:p>
       <w:r>
+        <w:rPr>
+          <w:sz w:val="20"/>
+        </w:rPr>
         <w:t xml:space="preserve">  source, or config. It *reads* those if present (as evidence) and treats their **absence</w:t>
       </w:r>
     </w:p>
     <w:p>
       <w:r>
+        <w:rPr>
+          <w:sz w:val="20"/>
+        </w:rPr>
         <w:t xml:space="preserve">  as a finding, not an error** — it won't create them. Generated scripts live in</w:t>
       </w:r>
     </w:p>
     <w:p>
       <w:r>
+        <w:rPr>
+          <w:sz w:val="20"/>
+        </w:rPr>
         <w:t xml:space="preserve">  `Qualification/scripts/`, not in your test tree.</w:t>
       </w:r>
     </w:p>
@@ -1041,21 +1381,28 @@
       <w:r>
         <w:rPr>
           <w:b/>
+          <w:sz w:val="20"/>
         </w:rPr>
         <w:t>Draft, traceable, approval-gated</w:t>
       </w:r>
       <w:r>
+        <w:rPr>
+          <w:sz w:val="20"/>
+        </w:rPr>
         <w:t xml:space="preserve"> — every claim cites its evidence; the pack is</w:t>
       </w:r>
     </w:p>
     <w:p>
       <w:r>
+        <w:rPr>
+          <w:sz w:val="20"/>
+        </w:rPr>
         <w:t xml:space="preserve">  reviewed and approved by appropriately qualified and authorized personnel.</w:t>
       </w:r>
     </w:p>
     <w:sectPr>
-      <w:pgSz w:w="12240" w:h="15840"/>
-      <w:pgMar w:top="1440" w:right="1800" w:bottom="1440" w:left="1800" w:header="720" w:footer="720" w:gutter="0"/>
+      <w:pgSz w:w="15840" w:h="12240" w:orient="landscape"/>
+      <w:pgMar w:top="864" w:right="864" w:bottom="864" w:left="864" w:header="720" w:footer="720" w:gutter="0"/>
       <w:cols w:space="720"/>
       <w:docGrid w:linePitch="360"/>
     </w:sectPr>
@@ -1428,7 +1775,7 @@
     <w:rsid w:val="00FC693F"/>
     <w:rPr>
       <w:rFonts w:ascii="Calibri" w:hAnsi="Calibri"/>
-      <w:sz w:val="21"/>
+      <w:sz w:val="20"/>
     </w:rPr>
   </w:style>
   <w:style w:type="paragraph" w:styleId="Header">

</xml_diff>

<commit_message>
Make "Plain English, always" a first-class engine principle
A developer couldn't parse a generated gap — so plain English is now a top-level rule
across the WHOLE pack (verdicts, test-case descriptions, gaps, summary), not just the gap
register: say what it is and why it matters; technical detail goes in scripts/remediation,
not the narrative. Added to the protocol, all three qualifier agents, and the user guide.

Co-Authored-By: Claude Opus 4.7 (1M context) <noreply@anthropic.com>
</commit_message>
<xml_diff>
--- a/docs/how-to-qualify.docx
+++ b/docs/how-to-qualify.docx
@@ -1245,6 +1245,40 @@
           <w:b/>
           <w:sz w:val="20"/>
         </w:rPr>
+        <w:t>Plain English, always</w:t>
+      </w:r>
+      <w:r>
+        <w:rPr>
+          <w:sz w:val="20"/>
+        </w:rPr>
+        <w:t xml:space="preserve"> — verdicts, findings, and gaps are written so any reader</w:t>
+      </w:r>
+    </w:p>
+    <w:p>
+      <w:r>
+        <w:rPr>
+          <w:sz w:val="20"/>
+        </w:rPr>
+        <w:t xml:space="preserve">  follows them without decoding jargon (not just a developer): what it is *and why it</w:t>
+      </w:r>
+    </w:p>
+    <w:p>
+      <w:r>
+        <w:rPr>
+          <w:sz w:val="20"/>
+        </w:rPr>
+        <w:t xml:space="preserve">  matters*. Technical detail lives in the scripts/remediation, not the narrative.</w:t>
+      </w:r>
+    </w:p>
+    <w:p>
+      <w:pPr>
+        <w:pStyle w:val="ListBullet"/>
+      </w:pPr>
+      <w:r>
+        <w:rPr>
+          <w:b/>
+          <w:sz w:val="20"/>
+        </w:rPr>
         <w:t>No stack assumptions</w:t>
       </w:r>
       <w:r>

</xml_diff>

<commit_message>
Rename GitHub home: DeepJam → paraqualis
The canonical home of the toolkit moves to the ParaQualis org so the public
URL matches the brand from day one. Repo transfer is performed in the same
release window; GitHub will redirect the old DeepJam/ URLs transparently for
existing clones, but new docs and install commands use the paraqualis/ path.

Touched (13 references across 7 files):
- .claude-plugin/plugin.json   — author.url, homepage, repository
- .claude-plugin/marketplace.json — owner.url
- README.md                    — install commands (plugin + from-source)
- CHANGELOG.md                 — install line + v1.0.0 release-notes link
- SECURITY.md                  — public repo link
- docs/OVERVIEW.md             — Quick start plugin one-liner
- docs/how-to-qualify.md       — clone commands (SSH + HTTPS)
- docs/*.docx                  — regenerated to reflect the new URLs

Co-Authored-By: Claude Opus 4.7 (1M context) <noreply@anthropic.com>
</commit_message>
<xml_diff>
--- a/docs/how-to-qualify.docx
+++ b/docs/how-to-qualify.docx
@@ -207,7 +207,7 @@
         <w:rPr>
           <w:sz w:val="20"/>
         </w:rPr>
-        <w:t xml:space="preserve">  `git clone git@github.com:DeepJam/paraqualis-skills.git`</w:t>
+        <w:t xml:space="preserve">  `git clone git@github.com:paraqualis/paraqualis-skills.git`</w:t>
       </w:r>
     </w:p>
     <w:p>
@@ -233,7 +233,7 @@
         <w:rPr>
           <w:sz w:val="20"/>
         </w:rPr>
-        <w:t xml:space="preserve">  `git clone https://github.com/DeepJam/paraqualis-skills.git`</w:t>
+        <w:t xml:space="preserve">  `git clone https://github.com/paraqualis/paraqualis-skills.git`</w:t>
       </w:r>
     </w:p>
     <w:p>

</xml_diff>